<commit_message>
Update acceptance test report and implementation plan documents
Wat heb ik gedaan:

- acceptatietest rapport bijgewerkt naar 16 uitgevoerde testgevallen
- conclusie van het testrapport bijgewerkt
- implementatieplan aangepast naar de juiste SQL-bestandsnaam
- opleverinformatie laten aansluiten op de huidige versie
</commit_message>
<xml_diff>
--- a/docs/FitTrack_Acceptatietest_Rapport.docx
+++ b/docs/FitTrack_Acceptatietest_Rapport.docx
@@ -514,7 +514,13 @@
               <w:rPr>
                 <w:rFonts w:ascii="Arial" w:hAnsi="Arial" w:cs="Arial"/>
               </w:rPr>
-              <w:t>12</w:t>
+              <w:t>1</w:t>
+            </w:r>
+            <w:r>
+              <w:rPr>
+                <w:rFonts w:ascii="Arial" w:hAnsi="Arial" w:cs="Arial"/>
+              </w:rPr>
+              <w:t>6</w:t>
             </w:r>
           </w:p>
         </w:tc>
@@ -564,7 +570,13 @@
               <w:rPr>
                 <w:rFonts w:ascii="Arial" w:hAnsi="Arial" w:cs="Arial"/>
               </w:rPr>
-              <w:t>12</w:t>
+              <w:t>1</w:t>
+            </w:r>
+            <w:r>
+              <w:rPr>
+                <w:rFonts w:ascii="Arial" w:hAnsi="Arial" w:cs="Arial"/>
+              </w:rPr>
+              <w:t>6</w:t>
             </w:r>
           </w:p>
         </w:tc>
@@ -606,7 +618,13 @@
               <w:rPr>
                 <w:rFonts w:ascii="Arial" w:hAnsi="Arial" w:cs="Arial"/>
               </w:rPr>
-              <w:t>12</w:t>
+              <w:t>1</w:t>
+            </w:r>
+            <w:r>
+              <w:rPr>
+                <w:rFonts w:ascii="Arial" w:hAnsi="Arial" w:cs="Arial"/>
+              </w:rPr>
+              <w:t>6</w:t>
             </w:r>
           </w:p>
         </w:tc>
@@ -773,7 +791,19 @@
         <w:rPr>
           <w:rFonts w:ascii="Arial" w:hAnsi="Arial" w:cs="Arial"/>
         </w:rPr>
-        <w:t>Er zijn 12 testgevallen uitgevoerd. Alle uitgevoerde testgevallen zijn geslaagd (PASS). Er zijn geen openstaande bevindingen.</w:t>
+        <w:t>Er zijn 1</w:t>
+      </w:r>
+      <w:r>
+        <w:rPr>
+          <w:rFonts w:ascii="Arial" w:hAnsi="Arial" w:cs="Arial"/>
+        </w:rPr>
+        <w:t>6</w:t>
+      </w:r>
+      <w:r>
+        <w:rPr>
+          <w:rFonts w:ascii="Arial" w:hAnsi="Arial" w:cs="Arial"/>
+        </w:rPr>
+        <w:t xml:space="preserve"> testgevallen uitgevoerd. Alle uitgevoerde testgevallen zijn geslaagd (PASS). Er zijn geen openstaande bevindingen.</w:t>
       </w:r>
     </w:p>
     <w:p>
@@ -1038,509 +1068,140 @@
           <w:szCs w:val="24"/>
         </w:rPr>
       </w:pPr>
-      <w:r>
+    </w:p>
+    <w:p>
+      <w:pPr>
+        <w:spacing w:after="0"/>
         <w:rPr>
           <w:rFonts w:ascii="Arial" w:hAnsi="Arial" w:cs="Arial"/>
           <w:b/>
           <w:sz w:val="24"/>
           <w:szCs w:val="24"/>
         </w:rPr>
+      </w:pPr>
+    </w:p>
+    <w:p>
+      <w:pPr>
+        <w:spacing w:after="0"/>
+        <w:rPr>
+          <w:rFonts w:ascii="Arial" w:hAnsi="Arial" w:cs="Arial"/>
+          <w:b/>
+          <w:sz w:val="24"/>
+          <w:szCs w:val="24"/>
+        </w:rPr>
+      </w:pPr>
+      <w:r>
+        <w:rPr>
+          <w:rFonts w:ascii="Arial" w:hAnsi="Arial" w:cs="Arial"/>
+          <w:b/>
+          <w:sz w:val="24"/>
+          <w:szCs w:val="24"/>
+        </w:rPr>
         <w:t>Niet uitgevoerde testgevallen</w:t>
       </w:r>
     </w:p>
-    <w:tbl>
-      <w:tblPr>
-        <w:tblStyle w:val="TableGrid"/>
-        <w:tblW w:w="0" w:type="auto"/>
-        <w:tblLook w:val="04A0" w:firstRow="1" w:lastRow="0" w:firstColumn="1" w:lastColumn="0" w:noHBand="0" w:noVBand="1"/>
-      </w:tblPr>
-      <w:tblGrid>
-        <w:gridCol w:w="864"/>
-        <w:gridCol w:w="1231"/>
-        <w:gridCol w:w="2992"/>
-        <w:gridCol w:w="999"/>
-        <w:gridCol w:w="2930"/>
-      </w:tblGrid>
-      <w:tr>
-        <w:tc>
-          <w:tcPr>
-            <w:tcW w:w="871" w:type="dxa"/>
-            <w:shd w:val="clear" w:color="auto" w:fill="D9D9D9" w:themeFill="background1" w:themeFillShade="D9"/>
-          </w:tcPr>
-          <w:p>
-            <w:pPr>
-              <w:rPr>
-                <w:rFonts w:ascii="Arial" w:hAnsi="Arial" w:cs="Arial"/>
-                <w:b/>
-              </w:rPr>
-            </w:pPr>
-            <w:r>
-              <w:rPr>
-                <w:rFonts w:ascii="Arial" w:hAnsi="Arial" w:cs="Arial"/>
-                <w:b/>
-              </w:rPr>
-              <w:t>Req</w:t>
-            </w:r>
-          </w:p>
-        </w:tc>
-        <w:tc>
-          <w:tcPr>
-            <w:tcW w:w="1192" w:type="dxa"/>
-            <w:shd w:val="clear" w:color="auto" w:fill="D9D9D9" w:themeFill="background1" w:themeFillShade="D9"/>
-          </w:tcPr>
-          <w:p>
-            <w:pPr>
-              <w:jc w:val="center"/>
-              <w:rPr>
-                <w:rFonts w:ascii="Arial" w:hAnsi="Arial" w:cs="Arial"/>
-                <w:b/>
-              </w:rPr>
-            </w:pPr>
-            <w:r>
-              <w:rPr>
-                <w:rFonts w:ascii="Arial" w:hAnsi="Arial" w:cs="Arial"/>
-                <w:b/>
-              </w:rPr>
-              <w:t>Testgeval</w:t>
-            </w:r>
-          </w:p>
-        </w:tc>
-        <w:tc>
-          <w:tcPr>
-            <w:tcW w:w="3034" w:type="dxa"/>
-            <w:shd w:val="clear" w:color="auto" w:fill="D9D9D9" w:themeFill="background1" w:themeFillShade="D9"/>
-          </w:tcPr>
-          <w:p>
-            <w:pPr>
-              <w:rPr>
-                <w:rFonts w:ascii="Arial" w:hAnsi="Arial" w:cs="Arial"/>
-                <w:b/>
-              </w:rPr>
-            </w:pPr>
-            <w:r>
-              <w:rPr>
-                <w:rFonts w:ascii="Arial" w:hAnsi="Arial" w:cs="Arial"/>
-                <w:b/>
-              </w:rPr>
-              <w:t>Omschrijving</w:t>
-            </w:r>
-          </w:p>
-        </w:tc>
-        <w:tc>
-          <w:tcPr>
-            <w:tcW w:w="939" w:type="dxa"/>
-            <w:shd w:val="clear" w:color="auto" w:fill="D9D9D9" w:themeFill="background1" w:themeFillShade="D9"/>
-          </w:tcPr>
-          <w:p>
-            <w:pPr>
-              <w:jc w:val="center"/>
-              <w:rPr>
-                <w:rFonts w:ascii="Arial" w:hAnsi="Arial" w:cs="Arial"/>
-                <w:b/>
-              </w:rPr>
-            </w:pPr>
-            <w:r>
-              <w:rPr>
-                <w:rFonts w:ascii="Arial" w:hAnsi="Arial" w:cs="Arial"/>
-                <w:b/>
-              </w:rPr>
-              <w:t>Impact</w:t>
-            </w:r>
-          </w:p>
-        </w:tc>
-        <w:tc>
-          <w:tcPr>
-            <w:tcW w:w="2980" w:type="dxa"/>
-            <w:shd w:val="clear" w:color="auto" w:fill="D9D9D9" w:themeFill="background1" w:themeFillShade="D9"/>
-          </w:tcPr>
-          <w:p>
-            <w:pPr>
-              <w:rPr>
-                <w:rFonts w:ascii="Arial" w:hAnsi="Arial" w:cs="Arial"/>
-                <w:b/>
-              </w:rPr>
-            </w:pPr>
-            <w:r>
-              <w:rPr>
-                <w:rFonts w:ascii="Arial" w:hAnsi="Arial" w:cs="Arial"/>
-                <w:b/>
-              </w:rPr>
-              <w:t>Bevinding</w:t>
-            </w:r>
-          </w:p>
-        </w:tc>
-      </w:tr>
-      <w:tr>
-        <w:tc>
-          <w:tcPr>
-            <w:tcW w:w="871" w:type="dxa"/>
-          </w:tcPr>
-          <w:p>
-            <w:pPr>
-              <w:rPr>
-                <w:rFonts w:ascii="Arial" w:hAnsi="Arial" w:cs="Arial"/>
-              </w:rPr>
-            </w:pPr>
-            <w:r>
-              <w:rPr>
-                <w:rFonts w:ascii="Arial" w:hAnsi="Arial" w:cs="Arial"/>
-              </w:rPr>
-              <w:t>4,9</w:t>
-            </w:r>
-          </w:p>
-        </w:tc>
-        <w:tc>
-          <w:tcPr>
-            <w:tcW w:w="1192" w:type="dxa"/>
-          </w:tcPr>
-          <w:p>
-            <w:pPr>
-              <w:rPr>
-                <w:rFonts w:ascii="Arial" w:hAnsi="Arial" w:cs="Arial"/>
-              </w:rPr>
-            </w:pPr>
-            <w:r>
-              <w:rPr>
-                <w:rFonts w:ascii="Arial" w:hAnsi="Arial" w:cs="Arial"/>
-              </w:rPr>
-              <w:t>TC-13</w:t>
-            </w:r>
-          </w:p>
-        </w:tc>
-        <w:tc>
-          <w:tcPr>
-            <w:tcW w:w="3034" w:type="dxa"/>
-          </w:tcPr>
-          <w:p>
-            <w:pPr>
-              <w:rPr>
-                <w:rFonts w:ascii="Arial" w:hAnsi="Arial" w:cs="Arial"/>
-              </w:rPr>
-            </w:pPr>
-            <w:r>
-              <w:rPr>
-                <w:rFonts w:ascii="Arial" w:hAnsi="Arial" w:cs="Arial"/>
-              </w:rPr>
-              <w:t>Overview - Edit workout note: Workout note aanpassen</w:t>
-            </w:r>
-          </w:p>
-        </w:tc>
-        <w:tc>
-          <w:tcPr>
-            <w:tcW w:w="939" w:type="dxa"/>
-          </w:tcPr>
-          <w:p>
-            <w:pPr>
-              <w:rPr>
-                <w:rFonts w:ascii="Arial" w:hAnsi="Arial" w:cs="Arial"/>
-              </w:rPr>
-            </w:pPr>
-            <w:r>
-              <w:rPr>
-                <w:rFonts w:ascii="Arial" w:hAnsi="Arial" w:cs="Arial"/>
-              </w:rPr>
-              <w:t>Medium</w:t>
-            </w:r>
-          </w:p>
-        </w:tc>
-        <w:tc>
-          <w:tcPr>
-            <w:tcW w:w="2980" w:type="dxa"/>
-          </w:tcPr>
-          <w:p>
-            <w:pPr>
-              <w:rPr>
-                <w:rFonts w:ascii="Arial" w:hAnsi="Arial" w:cs="Arial"/>
-              </w:rPr>
-            </w:pPr>
-            <w:r>
-              <w:rPr>
-                <w:rFonts w:ascii="Arial" w:hAnsi="Arial" w:cs="Arial"/>
-              </w:rPr>
-              <w:t>Niet uitgevoerd (aanrader voor volledige CRUD-dekking).</w:t>
-            </w:r>
-          </w:p>
-        </w:tc>
-      </w:tr>
-      <w:tr>
-        <w:tc>
-          <w:tcPr>
-            <w:tcW w:w="871" w:type="dxa"/>
-          </w:tcPr>
-          <w:p>
-            <w:pPr>
-              <w:rPr>
-                <w:rFonts w:ascii="Arial" w:hAnsi="Arial" w:cs="Arial"/>
-              </w:rPr>
-            </w:pPr>
-            <w:r>
-              <w:rPr>
-                <w:rFonts w:ascii="Arial" w:hAnsi="Arial" w:cs="Arial"/>
-              </w:rPr>
-              <w:t>4,9</w:t>
-            </w:r>
-          </w:p>
-        </w:tc>
-        <w:tc>
-          <w:tcPr>
-            <w:tcW w:w="1192" w:type="dxa"/>
-          </w:tcPr>
-          <w:p>
-            <w:pPr>
-              <w:rPr>
-                <w:rFonts w:ascii="Arial" w:hAnsi="Arial" w:cs="Arial"/>
-              </w:rPr>
-            </w:pPr>
-            <w:r>
-              <w:rPr>
-                <w:rFonts w:ascii="Arial" w:hAnsi="Arial" w:cs="Arial"/>
-              </w:rPr>
-              <w:t>TC-14</w:t>
-            </w:r>
-          </w:p>
-        </w:tc>
-        <w:tc>
-          <w:tcPr>
-            <w:tcW w:w="3034" w:type="dxa"/>
-          </w:tcPr>
-          <w:p>
-            <w:pPr>
-              <w:rPr>
-                <w:rFonts w:ascii="Arial" w:hAnsi="Arial" w:cs="Arial"/>
-              </w:rPr>
-            </w:pPr>
-            <w:r>
-              <w:rPr>
-                <w:rFonts w:ascii="Arial" w:hAnsi="Arial" w:cs="Arial"/>
-              </w:rPr>
-              <w:t>Overview - Delete workout: Workout verwijderen</w:t>
-            </w:r>
-          </w:p>
-        </w:tc>
-        <w:tc>
-          <w:tcPr>
-            <w:tcW w:w="939" w:type="dxa"/>
-          </w:tcPr>
-          <w:p>
-            <w:pPr>
-              <w:rPr>
-                <w:rFonts w:ascii="Arial" w:hAnsi="Arial" w:cs="Arial"/>
-              </w:rPr>
-            </w:pPr>
-            <w:r>
-              <w:rPr>
-                <w:rFonts w:ascii="Arial" w:hAnsi="Arial" w:cs="Arial"/>
-              </w:rPr>
-              <w:t>Medium</w:t>
-            </w:r>
-          </w:p>
-        </w:tc>
-        <w:tc>
-          <w:tcPr>
-            <w:tcW w:w="2980" w:type="dxa"/>
-          </w:tcPr>
-          <w:p>
-            <w:pPr>
-              <w:rPr>
-                <w:rFonts w:ascii="Arial" w:hAnsi="Arial" w:cs="Arial"/>
-              </w:rPr>
-            </w:pPr>
-            <w:r>
-              <w:rPr>
-                <w:rFonts w:ascii="Arial" w:hAnsi="Arial" w:cs="Arial"/>
-              </w:rPr>
-              <w:t>Niet uitgevoerd (aanrader voor volledige CRUD-dekking).</w:t>
-            </w:r>
-          </w:p>
-        </w:tc>
-      </w:tr>
-      <w:tr>
-        <w:tc>
-          <w:tcPr>
-            <w:tcW w:w="871" w:type="dxa"/>
-          </w:tcPr>
-          <w:p>
-            <w:pPr>
-              <w:rPr>
-                <w:rFonts w:ascii="Arial" w:hAnsi="Arial" w:cs="Arial"/>
-              </w:rPr>
-            </w:pPr>
-            <w:r>
-              <w:rPr>
-                <w:rFonts w:ascii="Arial" w:hAnsi="Arial" w:cs="Arial"/>
-              </w:rPr>
-              <w:t>4,9</w:t>
-            </w:r>
-          </w:p>
-        </w:tc>
-        <w:tc>
-          <w:tcPr>
-            <w:tcW w:w="1192" w:type="dxa"/>
-          </w:tcPr>
-          <w:p>
-            <w:pPr>
-              <w:rPr>
-                <w:rFonts w:ascii="Arial" w:hAnsi="Arial" w:cs="Arial"/>
-              </w:rPr>
-            </w:pPr>
-            <w:r>
-              <w:rPr>
-                <w:rFonts w:ascii="Arial" w:hAnsi="Arial" w:cs="Arial"/>
-              </w:rPr>
-              <w:t>TC-15</w:t>
-            </w:r>
-          </w:p>
-        </w:tc>
-        <w:tc>
-          <w:tcPr>
-            <w:tcW w:w="3034" w:type="dxa"/>
-          </w:tcPr>
-          <w:p>
-            <w:pPr>
-              <w:rPr>
-                <w:rFonts w:ascii="Arial" w:hAnsi="Arial" w:cs="Arial"/>
-                <w:lang w:val="en-US"/>
-              </w:rPr>
-            </w:pPr>
-            <w:r>
-              <w:rPr>
-                <w:rFonts w:ascii="Arial" w:hAnsi="Arial" w:cs="Arial"/>
-                <w:lang w:val="en-US"/>
-              </w:rPr>
-              <w:t>Workout entry - Edit training: Workout entry aanpassen</w:t>
-            </w:r>
-          </w:p>
-        </w:tc>
-        <w:tc>
-          <w:tcPr>
-            <w:tcW w:w="939" w:type="dxa"/>
-          </w:tcPr>
-          <w:p>
-            <w:pPr>
-              <w:rPr>
-                <w:rFonts w:ascii="Arial" w:hAnsi="Arial" w:cs="Arial"/>
-              </w:rPr>
-            </w:pPr>
-            <w:r>
-              <w:rPr>
-                <w:rFonts w:ascii="Arial" w:hAnsi="Arial" w:cs="Arial"/>
-              </w:rPr>
-              <w:t>Medium</w:t>
-            </w:r>
-          </w:p>
-        </w:tc>
-        <w:tc>
-          <w:tcPr>
-            <w:tcW w:w="2980" w:type="dxa"/>
-          </w:tcPr>
-          <w:p>
-            <w:pPr>
-              <w:rPr>
-                <w:rFonts w:ascii="Arial" w:hAnsi="Arial" w:cs="Arial"/>
-              </w:rPr>
-            </w:pPr>
-            <w:r>
-              <w:rPr>
-                <w:rFonts w:ascii="Arial" w:hAnsi="Arial" w:cs="Arial"/>
-              </w:rPr>
-              <w:t>Niet uitgevoerd (aanrader voor volledige CRUD-dekking).</w:t>
-            </w:r>
-          </w:p>
-        </w:tc>
-      </w:tr>
-      <w:tr>
-        <w:tc>
-          <w:tcPr>
-            <w:tcW w:w="871" w:type="dxa"/>
-          </w:tcPr>
-          <w:p>
-            <w:pPr>
-              <w:rPr>
-                <w:rFonts w:ascii="Arial" w:hAnsi="Arial" w:cs="Arial"/>
-              </w:rPr>
-            </w:pPr>
-            <w:r>
-              <w:rPr>
-                <w:rFonts w:ascii="Arial" w:hAnsi="Arial" w:cs="Arial"/>
-              </w:rPr>
-              <w:t>4,9</w:t>
-            </w:r>
-          </w:p>
-        </w:tc>
-        <w:tc>
-          <w:tcPr>
-            <w:tcW w:w="1192" w:type="dxa"/>
-          </w:tcPr>
-          <w:p>
-            <w:pPr>
-              <w:rPr>
-                <w:rFonts w:ascii="Arial" w:hAnsi="Arial" w:cs="Arial"/>
-              </w:rPr>
-            </w:pPr>
-            <w:r>
-              <w:rPr>
-                <w:rFonts w:ascii="Arial" w:hAnsi="Arial" w:cs="Arial"/>
-              </w:rPr>
-              <w:t>TC-16</w:t>
-            </w:r>
-          </w:p>
-        </w:tc>
-        <w:tc>
-          <w:tcPr>
-            <w:tcW w:w="3034" w:type="dxa"/>
-          </w:tcPr>
-          <w:p>
-            <w:pPr>
-              <w:rPr>
-                <w:rFonts w:ascii="Arial" w:hAnsi="Arial" w:cs="Arial"/>
-              </w:rPr>
-            </w:pPr>
-            <w:r>
-              <w:rPr>
-                <w:rFonts w:ascii="Arial" w:hAnsi="Arial" w:cs="Arial"/>
-              </w:rPr>
-              <w:t>Workout entry - Delete training: Workout entry verwijderen</w:t>
-            </w:r>
-          </w:p>
-        </w:tc>
-        <w:tc>
-          <w:tcPr>
-            <w:tcW w:w="939" w:type="dxa"/>
-          </w:tcPr>
-          <w:p>
-            <w:pPr>
-              <w:rPr>
-                <w:rFonts w:ascii="Arial" w:hAnsi="Arial" w:cs="Arial"/>
-              </w:rPr>
-            </w:pPr>
-            <w:r>
-              <w:rPr>
-                <w:rFonts w:ascii="Arial" w:hAnsi="Arial" w:cs="Arial"/>
-              </w:rPr>
-              <w:t>Medium</w:t>
-            </w:r>
-          </w:p>
-        </w:tc>
-        <w:tc>
-          <w:tcPr>
-            <w:tcW w:w="2980" w:type="dxa"/>
-          </w:tcPr>
-          <w:p>
-            <w:pPr>
-              <w:rPr>
-                <w:rFonts w:ascii="Arial" w:hAnsi="Arial" w:cs="Arial"/>
-              </w:rPr>
-            </w:pPr>
-            <w:r>
-              <w:rPr>
-                <w:rFonts w:ascii="Arial" w:hAnsi="Arial" w:cs="Arial"/>
-              </w:rPr>
-              <w:t>Niet uitgevoerd (aanrader voor volledige CRUD-dekking).</w:t>
-            </w:r>
-          </w:p>
-        </w:tc>
-      </w:tr>
-    </w:tbl>
+    <w:p>
+      <w:pPr>
+        <w:spacing w:after="0"/>
+        <w:rPr>
+          <w:rFonts w:ascii="Arial" w:hAnsi="Arial" w:cs="Arial"/>
+        </w:rPr>
+      </w:pPr>
+      <w:r>
+        <w:rPr>
+          <w:rFonts w:ascii="Arial" w:hAnsi="Arial" w:cs="Arial"/>
+        </w:rPr>
+        <w:t>Er zijn geen niet-uitgevoerde testgevallen. Alle 16 testgevallen uit het testgevallenbestand zijn uitgevoerd en hebben PASS als resultaat.</w:t>
+      </w:r>
+    </w:p>
+    <w:p>
+      <w:pPr>
+        <w:spacing w:after="0"/>
+        <w:rPr>
+          <w:rFonts w:ascii="Arial" w:hAnsi="Arial" w:cs="Arial"/>
+        </w:rPr>
+      </w:pPr>
+    </w:p>
+    <w:p>
+      <w:pPr>
+        <w:spacing w:after="0"/>
+        <w:rPr>
+          <w:rFonts w:ascii="Arial" w:hAnsi="Arial" w:cs="Arial"/>
+        </w:rPr>
+      </w:pPr>
+    </w:p>
+    <w:p>
+      <w:pPr>
+        <w:spacing w:after="0"/>
+        <w:rPr>
+          <w:rFonts w:ascii="Arial" w:hAnsi="Arial" w:cs="Arial"/>
+        </w:rPr>
+      </w:pPr>
+    </w:p>
+    <w:p>
+      <w:pPr>
+        <w:spacing w:after="0"/>
+        <w:rPr>
+          <w:rFonts w:ascii="Arial" w:hAnsi="Arial" w:cs="Arial"/>
+        </w:rPr>
+      </w:pPr>
+    </w:p>
+    <w:p>
+      <w:pPr>
+        <w:spacing w:after="0"/>
+        <w:rPr>
+          <w:rFonts w:ascii="Arial" w:hAnsi="Arial" w:cs="Arial"/>
+        </w:rPr>
+      </w:pPr>
+    </w:p>
+    <w:p>
+      <w:pPr>
+        <w:spacing w:after="0"/>
+        <w:rPr>
+          <w:rFonts w:ascii="Arial" w:hAnsi="Arial" w:cs="Arial"/>
+        </w:rPr>
+      </w:pPr>
+    </w:p>
+    <w:p>
+      <w:pPr>
+        <w:spacing w:after="0"/>
+        <w:rPr>
+          <w:rFonts w:ascii="Arial" w:hAnsi="Arial" w:cs="Arial"/>
+        </w:rPr>
+      </w:pPr>
+    </w:p>
+    <w:p>
+      <w:pPr>
+        <w:spacing w:after="0"/>
+        <w:rPr>
+          <w:rFonts w:ascii="Arial" w:hAnsi="Arial" w:cs="Arial"/>
+        </w:rPr>
+      </w:pPr>
+    </w:p>
+    <w:p>
+      <w:pPr>
+        <w:spacing w:after="0"/>
+        <w:rPr>
+          <w:rFonts w:ascii="Arial" w:hAnsi="Arial" w:cs="Arial"/>
+        </w:rPr>
+      </w:pPr>
+    </w:p>
+    <w:p>
+      <w:pPr>
+        <w:spacing w:after="0"/>
+        <w:rPr>
+          <w:rFonts w:ascii="Arial" w:hAnsi="Arial" w:cs="Arial"/>
+        </w:rPr>
+      </w:pPr>
+    </w:p>
+    <w:p>
+      <w:pPr>
+        <w:spacing w:after="0"/>
+        <w:rPr>
+          <w:rFonts w:ascii="Arial" w:hAnsi="Arial" w:cs="Arial"/>
+        </w:rPr>
+      </w:pPr>
+    </w:p>
     <w:p>
       <w:pPr>
         <w:spacing w:after="0"/>
@@ -1555,13 +1216,25 @@
         <w:jc w:val="center"/>
         <w:rPr>
           <w:rFonts w:ascii="Arial" w:hAnsi="Arial" w:cs="Arial"/>
+          <w:i/>
+          <w:iCs/>
         </w:rPr>
       </w:pPr>
       <w:r>
         <w:rPr>
           <w:rFonts w:ascii="Arial" w:hAnsi="Arial" w:cs="Arial"/>
-        </w:rPr>
-        <w:t>Conclusie: FitTrack voldoet aan de belangrijkste acceptatiecriteria op basis van de uitgevoerde acceptatietest. De applicatie kan worden gedemonstreerd en ingeleverd.</w:t>
+          <w:i/>
+          <w:iCs/>
+        </w:rPr>
+        <w:t>Conclusie: FitTrack voldoet aan de acceptatiecriteria op basis van de uitgevoerde acceptatietest. Alle 16 testgevallen zijn uitgevoerd en geslaagd. De applicatie kan worden gedemonstreerd en ingeleverd</w:t>
+      </w:r>
+      <w:r>
+        <w:rPr>
+          <w:rFonts w:ascii="Arial" w:hAnsi="Arial" w:cs="Arial"/>
+          <w:i/>
+          <w:iCs/>
+        </w:rPr>
+        <w:t>.</w:t>
       </w:r>
     </w:p>
     <w:p>
@@ -2034,20 +1707,13 @@
         <w:rPr>
           <w:rFonts w:ascii="Arial" w:hAnsi="Arial" w:cs="Arial"/>
         </w:rPr>
-        <w:t>- Voer de testgevallen uit volgens het spreadsheet FitTrack_Testgevallen_ingevuld.xlsx.</w:t>
+        <w:t xml:space="preserve">- </w:t>
       </w:r>
-    </w:p>
-    <w:p>
-      <w:pPr>
-        <w:rPr>
-          <w:rFonts w:ascii="Arial" w:hAnsi="Arial" w:cs="Arial"/>
-        </w:rPr>
-      </w:pPr>
       <w:r>
         <w:rPr>
           <w:rFonts w:ascii="Arial" w:hAnsi="Arial" w:cs="Arial"/>
         </w:rPr>
-        <w:t>- Noteer PASS/FAIL en voeg eventueel screenshots toe (bewijslast).</w:t>
+        <w:t>De aanvullende testgevallen TC-13 t/m TC-16 zijn uitgevoerd.</w:t>
       </w:r>
     </w:p>
     <w:p>
@@ -2060,8 +1726,40 @@
         <w:rPr>
           <w:rFonts w:ascii="Arial" w:hAnsi="Arial" w:cs="Arial"/>
         </w:rPr>
-        <w:t>- Update daarna de samenvatting bovenaan: totaal uitgevoerd / passed / bevindingen.</w:t>
+        <w:t xml:space="preserve">- </w:t>
       </w:r>
+      <w:r>
+        <w:rPr>
+          <w:rFonts w:ascii="Arial" w:hAnsi="Arial" w:cs="Arial"/>
+        </w:rPr>
+        <w:t>De resultaten zijn verwerkt in het testgevallenbestand.</w:t>
+      </w:r>
+    </w:p>
+    <w:p>
+      <w:pPr>
+        <w:rPr>
+          <w:rFonts w:ascii="Arial" w:hAnsi="Arial" w:cs="Arial"/>
+        </w:rPr>
+      </w:pPr>
+      <w:r>
+        <w:rPr>
+          <w:rFonts w:ascii="Arial" w:hAnsi="Arial" w:cs="Arial"/>
+        </w:rPr>
+        <w:t xml:space="preserve">- </w:t>
+      </w:r>
+      <w:r>
+        <w:rPr>
+          <w:rFonts w:ascii="Arial" w:hAnsi="Arial" w:cs="Arial"/>
+        </w:rPr>
+        <w:t>Alle aanvullende testgevallen hebben PASS als resultaat.</w:t>
+      </w:r>
+    </w:p>
+    <w:p>
+      <w:pPr>
+        <w:rPr>
+          <w:rFonts w:ascii="Arial" w:hAnsi="Arial" w:cs="Arial"/>
+        </w:rPr>
+      </w:pPr>
     </w:p>
     <w:sectPr>
       <w:footerReference w:type="default" r:id="rId11"/>
@@ -2817,7 +2515,6 @@
   <w:style w:type="character" w:default="1" w:styleId="DefaultParagraphFont">
     <w:name w:val="Default Paragraph Font"/>
     <w:uiPriority w:val="1"/>
-    <w:semiHidden/>
     <w:unhideWhenUsed/>
   </w:style>
   <w:style w:type="table" w:default="1" w:styleId="TableNormal">

</xml_diff>